<commit_message>
complete the word document
</commit_message>
<xml_diff>
--- a/Documents/word.docx
+++ b/Documents/word.docx
@@ -3,12 +3,23 @@
 <w:document xmlns:wpc="http://schemas.microsoft.com/office/word/2010/wordprocessingCanvas" xmlns:cx="http://schemas.microsoft.com/office/drawing/2014/chartex" xmlns:cx1="http://schemas.microsoft.com/office/drawing/2015/9/8/chartex" xmlns:cx2="http://schemas.microsoft.com/office/drawing/2015/10/21/chartex" xmlns:cx3="http://schemas.microsoft.com/office/drawing/2016/5/9/chartex" xmlns:cx4="http://schemas.microsoft.com/office/drawing/2016/5/10/chartex" xmlns:cx5="http://schemas.microsoft.com/office/drawing/2016/5/11/chartex" xmlns:cx6="http://schemas.microsoft.com/office/drawing/2016/5/12/chartex" xmlns:cx7="http://schemas.microsoft.com/office/drawing/2016/5/13/chartex" xmlns:cx8="http://schemas.microsoft.com/office/drawing/2016/5/14/chartex" xmlns:mc="http://schemas.openxmlformats.org/markup-compatibility/2006" xmlns:aink="http://schemas.microsoft.com/office/drawing/2016/ink" xmlns:am3d="http://schemas.microsoft.com/office/drawing/2017/model3d" xmlns:o="urn:schemas-microsoft-com:office:office" xmlns:r="http://schemas.openxmlformats.org/officeDocument/2006/relationships" xmlns:m="http://schemas.openxmlformats.org/officeDocument/2006/math" xmlns:v="urn:schemas-microsoft-com:vml" xmlns:wp14="http://schemas.microsoft.com/office/word/2010/wordprocessingDrawing" xmlns:wp="http://schemas.openxmlformats.org/drawingml/2006/wordprocessingDrawing" xmlns:w10="urn:schemas-microsoft-com:office:word" xmlns:w="http://schemas.openxmlformats.org/wordprocessingml/2006/main" xmlns:w14="http://schemas.microsoft.com/office/word/2010/wordml" xmlns:w15="http://schemas.microsoft.com/office/word/2012/wordml" xmlns:w16cex="http://schemas.microsoft.com/office/word/2018/wordml/cex" xmlns:w16cid="http://schemas.microsoft.com/office/word/2016/wordml/cid" xmlns:w16="http://schemas.microsoft.com/office/word/2018/wordml" xmlns:w16sdtdh="http://schemas.microsoft.com/office/word/2020/wordml/sdtdatahash" xmlns:w16se="http://schemas.microsoft.com/office/word/2015/wordml/symex" xmlns:wpg="http://schemas.microsoft.com/office/word/2010/wordprocessingGroup" xmlns:wpi="http://schemas.microsoft.com/office/word/2010/wordprocessingInk" xmlns:wne="http://schemas.microsoft.com/office/word/2006/wordml" xmlns:wps="http://schemas.microsoft.com/office/word/2010/wordprocessingShape" mc:Ignorable="w14 w15 w16se w16cid w16 w16cex w16sdtdh wp14">
   <w:body>
     <w:p>
-      <w:r>
+      <w:pPr>
+        <w:rPr>
+          <w:u w:val="single"/>
+        </w:rPr>
+      </w:pPr>
+      <w:r>
+        <w:rPr>
+          <w:u w:val="single"/>
+        </w:rPr>
         <w:t>Task 01</w:t>
       </w:r>
     </w:p>
     <w:p>
       <w:r>
+        <w:rPr>
+          <w:noProof/>
+        </w:rPr>
         <w:drawing>
           <wp:inline distT="0" distB="0" distL="0" distR="0" wp14:anchorId="327FAF3E" wp14:editId="512EC040">
             <wp:extent cx="5076997" cy="2734310"/>
@@ -25,7 +36,7 @@
                     <pic:cNvPicPr/>
                   </pic:nvPicPr>
                   <pic:blipFill>
-                    <a:blip r:embed="rId6"/>
+                    <a:blip r:embed="rId7"/>
                     <a:stretch>
                       <a:fillRect/>
                     </a:stretch>
@@ -48,7 +59,15 @@
     </w:p>
     <w:p/>
     <w:p>
-      <w:r>
+      <w:pPr>
+        <w:rPr>
+          <w:u w:val="single"/>
+        </w:rPr>
+      </w:pPr>
+      <w:r>
+        <w:rPr>
+          <w:u w:val="single"/>
+        </w:rPr>
         <w:t>Task 02</w:t>
       </w:r>
     </w:p>
@@ -82,7 +101,7 @@
                     <pic:cNvPicPr/>
                   </pic:nvPicPr>
                   <pic:blipFill>
-                    <a:blip r:embed="rId7">
+                    <a:blip r:embed="rId8">
                       <a:extLst>
                         <a:ext uri="{28A0092B-C50C-407E-A947-70E740481C1C}">
                           <a14:useLocalDpi xmlns:a14="http://schemas.microsoft.com/office/drawing/2010/main" val="0"/>
@@ -130,63 +149,29 @@
     <w:p/>
     <w:p/>
     <w:p>
-      <w:r>
+      <w:pPr>
+        <w:rPr>
+          <w:u w:val="single"/>
+        </w:rPr>
+      </w:pPr>
+      <w:r>
+        <w:rPr>
+          <w:u w:val="single"/>
+        </w:rPr>
         <w:lastRenderedPageBreak/>
         <w:t>Task 04</w:t>
       </w:r>
     </w:p>
     <w:p>
       <w:r>
+        <w:rPr>
+          <w:noProof/>
+        </w:rPr>
         <w:drawing>
           <wp:inline distT="0" distB="0" distL="0" distR="0" wp14:anchorId="52D8FAA7" wp14:editId="7450CA97">
             <wp:extent cx="5943600" cy="3123565"/>
             <wp:effectExtent l="0" t="0" r="0" b="635"/>
             <wp:docPr id="3" name="Picture 3"/>
-            <wp:cNvGraphicFramePr>
-              <a:graphicFrameLocks xmlns:a="http://schemas.openxmlformats.org/drawingml/2006/main" noChangeAspect="1"/>
-            </wp:cNvGraphicFramePr>
-            <a:graphic xmlns:a="http://schemas.openxmlformats.org/drawingml/2006/main">
-              <a:graphicData uri="http://schemas.openxmlformats.org/drawingml/2006/picture">
-                <pic:pic xmlns:pic="http://schemas.openxmlformats.org/drawingml/2006/picture">
-                  <pic:nvPicPr>
-                    <pic:cNvPr id="1" name=""/>
-                    <pic:cNvPicPr/>
-                  </pic:nvPicPr>
-                  <pic:blipFill>
-                    <a:blip r:embed="rId8"/>
-                    <a:stretch>
-                      <a:fillRect/>
-                    </a:stretch>
-                  </pic:blipFill>
-                  <pic:spPr>
-                    <a:xfrm>
-                      <a:off x="0" y="0"/>
-                      <a:ext cx="5943600" cy="3123565"/>
-                    </a:xfrm>
-                    <a:prstGeom prst="rect">
-                      <a:avLst/>
-                    </a:prstGeom>
-                  </pic:spPr>
-                </pic:pic>
-              </a:graphicData>
-            </a:graphic>
-          </wp:inline>
-        </w:drawing>
-      </w:r>
-    </w:p>
-    <w:p/>
-    <w:p>
-      <w:r>
-        <w:t>Task 05</w:t>
-      </w:r>
-    </w:p>
-    <w:p>
-      <w:r>
-        <w:drawing>
-          <wp:inline distT="0" distB="0" distL="0" distR="0" wp14:anchorId="2E649BA5" wp14:editId="4E7D692C">
-            <wp:extent cx="5943600" cy="2199005"/>
-            <wp:effectExtent l="0" t="0" r="0" b="0"/>
-            <wp:docPr id="4" name="Picture 4"/>
             <wp:cNvGraphicFramePr>
               <a:graphicFrameLocks xmlns:a="http://schemas.openxmlformats.org/drawingml/2006/main" noChangeAspect="1"/>
             </wp:cNvGraphicFramePr>
@@ -206,7 +191,7 @@
                   <pic:spPr>
                     <a:xfrm>
                       <a:off x="0" y="0"/>
-                      <a:ext cx="5943600" cy="2199005"/>
+                      <a:ext cx="5943600" cy="3123565"/>
                     </a:xfrm>
                     <a:prstGeom prst="rect">
                       <a:avLst/>
@@ -220,24 +205,29 @@
       </w:r>
     </w:p>
     <w:p/>
-    <w:p/>
-    <w:p/>
-    <w:p/>
-    <w:p/>
-    <w:p/>
-    <w:p>
-      <w:r>
-        <w:lastRenderedPageBreak/>
-        <w:t>Task 06</w:t>
-      </w:r>
-    </w:p>
-    <w:p>
-      <w:r>
+    <w:p>
+      <w:pPr>
+        <w:rPr>
+          <w:u w:val="single"/>
+        </w:rPr>
+      </w:pPr>
+      <w:r>
+        <w:rPr>
+          <w:u w:val="single"/>
+        </w:rPr>
+        <w:t>Task 05</w:t>
+      </w:r>
+    </w:p>
+    <w:p>
+      <w:r>
+        <w:rPr>
+          <w:noProof/>
+        </w:rPr>
         <w:drawing>
-          <wp:inline distT="0" distB="0" distL="0" distR="0" wp14:anchorId="1DD57DD8" wp14:editId="41345477">
-            <wp:extent cx="5943600" cy="2192655"/>
+          <wp:inline distT="0" distB="0" distL="0" distR="0" wp14:anchorId="2E649BA5" wp14:editId="4E7D692C">
+            <wp:extent cx="5943600" cy="2199005"/>
             <wp:effectExtent l="0" t="0" r="0" b="0"/>
-            <wp:docPr id="5" name="Picture 5"/>
+            <wp:docPr id="4" name="Picture 4"/>
             <wp:cNvGraphicFramePr>
               <a:graphicFrameLocks xmlns:a="http://schemas.openxmlformats.org/drawingml/2006/main" noChangeAspect="1"/>
             </wp:cNvGraphicFramePr>
@@ -257,7 +247,7 @@
                   <pic:spPr>
                     <a:xfrm>
                       <a:off x="0" y="0"/>
-                      <a:ext cx="5943600" cy="2192655"/>
+                      <a:ext cx="5943600" cy="2199005"/>
                     </a:xfrm>
                     <a:prstGeom prst="rect">
                       <a:avLst/>
@@ -271,18 +261,35 @@
       </w:r>
     </w:p>
     <w:p/>
-    <w:p>
-      <w:r>
-        <w:t>Task 07</w:t>
-      </w:r>
-    </w:p>
-    <w:p>
-      <w:r>
+    <w:p/>
+    <w:p/>
+    <w:p/>
+    <w:p/>
+    <w:p/>
+    <w:p>
+      <w:pPr>
+        <w:rPr>
+          <w:u w:val="single"/>
+        </w:rPr>
+      </w:pPr>
+      <w:r>
+        <w:rPr>
+          <w:u w:val="single"/>
+        </w:rPr>
+        <w:lastRenderedPageBreak/>
+        <w:t>Task 06</w:t>
+      </w:r>
+    </w:p>
+    <w:p>
+      <w:r>
+        <w:rPr>
+          <w:noProof/>
+        </w:rPr>
         <w:drawing>
-          <wp:inline distT="0" distB="0" distL="0" distR="0" wp14:anchorId="7E13F5BA" wp14:editId="1B80F219">
-            <wp:extent cx="5943600" cy="1896745"/>
-            <wp:effectExtent l="0" t="0" r="0" b="8255"/>
-            <wp:docPr id="6" name="Picture 6"/>
+          <wp:inline distT="0" distB="0" distL="0" distR="0" wp14:anchorId="1DD57DD8" wp14:editId="41345477">
+            <wp:extent cx="5943600" cy="2192655"/>
+            <wp:effectExtent l="0" t="0" r="0" b="0"/>
+            <wp:docPr id="5" name="Picture 5"/>
             <wp:cNvGraphicFramePr>
               <a:graphicFrameLocks xmlns:a="http://schemas.openxmlformats.org/drawingml/2006/main" noChangeAspect="1"/>
             </wp:cNvGraphicFramePr>
@@ -302,7 +309,7 @@
                   <pic:spPr>
                     <a:xfrm>
                       <a:off x="0" y="0"/>
-                      <a:ext cx="5943600" cy="1896745"/>
+                      <a:ext cx="5943600" cy="2192655"/>
                     </a:xfrm>
                     <a:prstGeom prst="rect">
                       <a:avLst/>
@@ -317,17 +324,28 @@
     </w:p>
     <w:p/>
     <w:p>
-      <w:r>
-        <w:t>Task 08</w:t>
-      </w:r>
-    </w:p>
-    <w:p>
-      <w:r>
+      <w:pPr>
+        <w:rPr>
+          <w:u w:val="single"/>
+        </w:rPr>
+      </w:pPr>
+      <w:r>
+        <w:rPr>
+          <w:u w:val="single"/>
+        </w:rPr>
+        <w:t>Task 07</w:t>
+      </w:r>
+    </w:p>
+    <w:p>
+      <w:r>
+        <w:rPr>
+          <w:noProof/>
+        </w:rPr>
         <w:drawing>
-          <wp:inline distT="0" distB="0" distL="0" distR="0" wp14:anchorId="697DB3AD" wp14:editId="3E114F78">
-            <wp:extent cx="5943600" cy="2404110"/>
-            <wp:effectExtent l="0" t="0" r="0" b="0"/>
-            <wp:docPr id="7" name="Picture 7"/>
+          <wp:inline distT="0" distB="0" distL="0" distR="0" wp14:anchorId="7E13F5BA" wp14:editId="1B80F219">
+            <wp:extent cx="5943600" cy="1896745"/>
+            <wp:effectExtent l="0" t="0" r="0" b="8255"/>
+            <wp:docPr id="6" name="Picture 6"/>
             <wp:cNvGraphicFramePr>
               <a:graphicFrameLocks xmlns:a="http://schemas.openxmlformats.org/drawingml/2006/main" noChangeAspect="1"/>
             </wp:cNvGraphicFramePr>
@@ -347,6 +365,62 @@
                   <pic:spPr>
                     <a:xfrm>
                       <a:off x="0" y="0"/>
+                      <a:ext cx="5943600" cy="1896745"/>
+                    </a:xfrm>
+                    <a:prstGeom prst="rect">
+                      <a:avLst/>
+                    </a:prstGeom>
+                  </pic:spPr>
+                </pic:pic>
+              </a:graphicData>
+            </a:graphic>
+          </wp:inline>
+        </w:drawing>
+      </w:r>
+    </w:p>
+    <w:p/>
+    <w:p>
+      <w:pPr>
+        <w:rPr>
+          <w:u w:val="single"/>
+        </w:rPr>
+      </w:pPr>
+      <w:r>
+        <w:rPr>
+          <w:u w:val="single"/>
+        </w:rPr>
+        <w:t>Task 08</w:t>
+      </w:r>
+    </w:p>
+    <w:p>
+      <w:r>
+        <w:rPr>
+          <w:noProof/>
+        </w:rPr>
+        <w:drawing>
+          <wp:inline distT="0" distB="0" distL="0" distR="0" wp14:anchorId="697DB3AD" wp14:editId="3E114F78">
+            <wp:extent cx="5943600" cy="2404110"/>
+            <wp:effectExtent l="0" t="0" r="0" b="0"/>
+            <wp:docPr id="7" name="Picture 7"/>
+            <wp:cNvGraphicFramePr>
+              <a:graphicFrameLocks xmlns:a="http://schemas.openxmlformats.org/drawingml/2006/main" noChangeAspect="1"/>
+            </wp:cNvGraphicFramePr>
+            <a:graphic xmlns:a="http://schemas.openxmlformats.org/drawingml/2006/main">
+              <a:graphicData uri="http://schemas.openxmlformats.org/drawingml/2006/picture">
+                <pic:pic xmlns:pic="http://schemas.openxmlformats.org/drawingml/2006/picture">
+                  <pic:nvPicPr>
+                    <pic:cNvPr id="1" name=""/>
+                    <pic:cNvPicPr/>
+                  </pic:nvPicPr>
+                  <pic:blipFill>
+                    <a:blip r:embed="rId13"/>
+                    <a:stretch>
+                      <a:fillRect/>
+                    </a:stretch>
+                  </pic:blipFill>
+                  <pic:spPr>
+                    <a:xfrm>
+                      <a:off x="0" y="0"/>
                       <a:ext cx="5943600" cy="2404110"/>
                     </a:xfrm>
                     <a:prstGeom prst="rect">
@@ -360,8 +434,471 @@
         </w:drawing>
       </w:r>
     </w:p>
+    <w:p>
+      <w:pPr>
+        <w:rPr>
+          <w:u w:val="single"/>
+        </w:rPr>
+      </w:pPr>
+      <w:r>
+        <w:rPr>
+          <w:u w:val="single"/>
+        </w:rPr>
+        <w:lastRenderedPageBreak/>
+        <w:t>Task 09</w:t>
+      </w:r>
+    </w:p>
+    <w:p>
+      <w:r>
+        <w:t xml:space="preserve">Testing all the operations </w:t>
+      </w:r>
+    </w:p>
+    <w:p>
+      <w:pPr>
+        <w:pStyle w:val="ListParagraph"/>
+        <w:numPr>
+          <w:ilvl w:val="0"/>
+          <w:numId w:val="1"/>
+        </w:numPr>
+      </w:pPr>
+      <w:r>
+        <w:t>Validation</w:t>
+      </w:r>
+    </w:p>
+    <w:p>
+      <w:r>
+        <w:drawing>
+          <wp:inline distT="0" distB="0" distL="0" distR="0" wp14:anchorId="063A623B" wp14:editId="2B313516">
+            <wp:extent cx="3829050" cy="4941357"/>
+            <wp:effectExtent l="0" t="0" r="0" b="0"/>
+            <wp:docPr id="8" name="Picture 8"/>
+            <wp:cNvGraphicFramePr>
+              <a:graphicFrameLocks xmlns:a="http://schemas.openxmlformats.org/drawingml/2006/main" noChangeAspect="1"/>
+            </wp:cNvGraphicFramePr>
+            <a:graphic xmlns:a="http://schemas.openxmlformats.org/drawingml/2006/main">
+              <a:graphicData uri="http://schemas.openxmlformats.org/drawingml/2006/picture">
+                <pic:pic xmlns:pic="http://schemas.openxmlformats.org/drawingml/2006/picture">
+                  <pic:nvPicPr>
+                    <pic:cNvPr id="1" name=""/>
+                    <pic:cNvPicPr/>
+                  </pic:nvPicPr>
+                  <pic:blipFill>
+                    <a:blip r:embed="rId14"/>
+                    <a:stretch>
+                      <a:fillRect/>
+                    </a:stretch>
+                  </pic:blipFill>
+                  <pic:spPr>
+                    <a:xfrm>
+                      <a:off x="0" y="0"/>
+                      <a:ext cx="3835330" cy="4949462"/>
+                    </a:xfrm>
+                    <a:prstGeom prst="rect">
+                      <a:avLst/>
+                    </a:prstGeom>
+                  </pic:spPr>
+                </pic:pic>
+              </a:graphicData>
+            </a:graphic>
+          </wp:inline>
+        </w:drawing>
+      </w:r>
+    </w:p>
+    <w:p>
+      <w:r>
+        <w:drawing>
+          <wp:inline distT="0" distB="0" distL="0" distR="0" wp14:anchorId="0E97E592" wp14:editId="25B23BB4">
+            <wp:extent cx="5133975" cy="1804570"/>
+            <wp:effectExtent l="0" t="0" r="0" b="5715"/>
+            <wp:docPr id="9" name="Picture 9"/>
+            <wp:cNvGraphicFramePr>
+              <a:graphicFrameLocks xmlns:a="http://schemas.openxmlformats.org/drawingml/2006/main" noChangeAspect="1"/>
+            </wp:cNvGraphicFramePr>
+            <a:graphic xmlns:a="http://schemas.openxmlformats.org/drawingml/2006/main">
+              <a:graphicData uri="http://schemas.openxmlformats.org/drawingml/2006/picture">
+                <pic:pic xmlns:pic="http://schemas.openxmlformats.org/drawingml/2006/picture">
+                  <pic:nvPicPr>
+                    <pic:cNvPr id="1" name=""/>
+                    <pic:cNvPicPr/>
+                  </pic:nvPicPr>
+                  <pic:blipFill>
+                    <a:blip r:embed="rId15"/>
+                    <a:stretch>
+                      <a:fillRect/>
+                    </a:stretch>
+                  </pic:blipFill>
+                  <pic:spPr>
+                    <a:xfrm>
+                      <a:off x="0" y="0"/>
+                      <a:ext cx="5138096" cy="1806018"/>
+                    </a:xfrm>
+                    <a:prstGeom prst="rect">
+                      <a:avLst/>
+                    </a:prstGeom>
+                  </pic:spPr>
+                </pic:pic>
+              </a:graphicData>
+            </a:graphic>
+          </wp:inline>
+        </w:drawing>
+      </w:r>
+    </w:p>
+    <w:p/>
+    <w:p>
+      <w:pPr>
+        <w:pStyle w:val="ListParagraph"/>
+        <w:numPr>
+          <w:ilvl w:val="0"/>
+          <w:numId w:val="1"/>
+        </w:numPr>
+      </w:pPr>
+      <w:r>
+        <w:lastRenderedPageBreak/>
+        <w:t>Creation</w:t>
+      </w:r>
+    </w:p>
+    <w:p>
+      <w:r>
+        <w:drawing>
+          <wp:inline distT="0" distB="0" distL="0" distR="0" wp14:anchorId="741CCBB0" wp14:editId="7C93F92F">
+            <wp:extent cx="5943600" cy="7292340"/>
+            <wp:effectExtent l="0" t="0" r="0" b="3810"/>
+            <wp:docPr id="10" name="Picture 10"/>
+            <wp:cNvGraphicFramePr>
+              <a:graphicFrameLocks xmlns:a="http://schemas.openxmlformats.org/drawingml/2006/main" noChangeAspect="1"/>
+            </wp:cNvGraphicFramePr>
+            <a:graphic xmlns:a="http://schemas.openxmlformats.org/drawingml/2006/main">
+              <a:graphicData uri="http://schemas.openxmlformats.org/drawingml/2006/picture">
+                <pic:pic xmlns:pic="http://schemas.openxmlformats.org/drawingml/2006/picture">
+                  <pic:nvPicPr>
+                    <pic:cNvPr id="1" name=""/>
+                    <pic:cNvPicPr/>
+                  </pic:nvPicPr>
+                  <pic:blipFill>
+                    <a:blip r:embed="rId16"/>
+                    <a:stretch>
+                      <a:fillRect/>
+                    </a:stretch>
+                  </pic:blipFill>
+                  <pic:spPr>
+                    <a:xfrm>
+                      <a:off x="0" y="0"/>
+                      <a:ext cx="5943600" cy="7292340"/>
+                    </a:xfrm>
+                    <a:prstGeom prst="rect">
+                      <a:avLst/>
+                    </a:prstGeom>
+                  </pic:spPr>
+                </pic:pic>
+              </a:graphicData>
+            </a:graphic>
+          </wp:inline>
+        </w:drawing>
+      </w:r>
+    </w:p>
+    <w:p/>
+    <w:p/>
+    <w:p>
+      <w:pPr>
+        <w:pStyle w:val="ListParagraph"/>
+        <w:numPr>
+          <w:ilvl w:val="0"/>
+          <w:numId w:val="1"/>
+        </w:numPr>
+      </w:pPr>
+      <w:r>
+        <w:lastRenderedPageBreak/>
+        <w:t>Duplication</w:t>
+      </w:r>
+    </w:p>
+    <w:p>
+      <w:r>
+        <w:drawing>
+          <wp:inline distT="0" distB="0" distL="0" distR="0" wp14:anchorId="2436FD5A" wp14:editId="7BEA81C0">
+            <wp:extent cx="5943600" cy="3605530"/>
+            <wp:effectExtent l="0" t="0" r="0" b="0"/>
+            <wp:docPr id="11" name="Picture 11"/>
+            <wp:cNvGraphicFramePr>
+              <a:graphicFrameLocks xmlns:a="http://schemas.openxmlformats.org/drawingml/2006/main" noChangeAspect="1"/>
+            </wp:cNvGraphicFramePr>
+            <a:graphic xmlns:a="http://schemas.openxmlformats.org/drawingml/2006/main">
+              <a:graphicData uri="http://schemas.openxmlformats.org/drawingml/2006/picture">
+                <pic:pic xmlns:pic="http://schemas.openxmlformats.org/drawingml/2006/picture">
+                  <pic:nvPicPr>
+                    <pic:cNvPr id="1" name=""/>
+                    <pic:cNvPicPr/>
+                  </pic:nvPicPr>
+                  <pic:blipFill>
+                    <a:blip r:embed="rId17"/>
+                    <a:stretch>
+                      <a:fillRect/>
+                    </a:stretch>
+                  </pic:blipFill>
+                  <pic:spPr>
+                    <a:xfrm>
+                      <a:off x="0" y="0"/>
+                      <a:ext cx="5943600" cy="3605530"/>
+                    </a:xfrm>
+                    <a:prstGeom prst="rect">
+                      <a:avLst/>
+                    </a:prstGeom>
+                  </pic:spPr>
+                </pic:pic>
+              </a:graphicData>
+            </a:graphic>
+          </wp:inline>
+        </w:drawing>
+      </w:r>
+    </w:p>
+    <w:p/>
+    <w:p/>
+    <w:p>
+      <w:pPr>
+        <w:pStyle w:val="ListParagraph"/>
+        <w:numPr>
+          <w:ilvl w:val="0"/>
+          <w:numId w:val="1"/>
+        </w:numPr>
+      </w:pPr>
+      <w:r>
+        <w:t>Updating</w:t>
+      </w:r>
+    </w:p>
+    <w:p>
+      <w:r>
+        <w:drawing>
+          <wp:inline distT="0" distB="0" distL="0" distR="0" wp14:anchorId="5C0A878F" wp14:editId="4C4BED9A">
+            <wp:extent cx="5943600" cy="365760"/>
+            <wp:effectExtent l="0" t="0" r="0" b="0"/>
+            <wp:docPr id="12" name="Picture 12"/>
+            <wp:cNvGraphicFramePr>
+              <a:graphicFrameLocks xmlns:a="http://schemas.openxmlformats.org/drawingml/2006/main" noChangeAspect="1"/>
+            </wp:cNvGraphicFramePr>
+            <a:graphic xmlns:a="http://schemas.openxmlformats.org/drawingml/2006/main">
+              <a:graphicData uri="http://schemas.openxmlformats.org/drawingml/2006/picture">
+                <pic:pic xmlns:pic="http://schemas.openxmlformats.org/drawingml/2006/picture">
+                  <pic:nvPicPr>
+                    <pic:cNvPr id="1" name=""/>
+                    <pic:cNvPicPr/>
+                  </pic:nvPicPr>
+                  <pic:blipFill>
+                    <a:blip r:embed="rId18"/>
+                    <a:stretch>
+                      <a:fillRect/>
+                    </a:stretch>
+                  </pic:blipFill>
+                  <pic:spPr>
+                    <a:xfrm>
+                      <a:off x="0" y="0"/>
+                      <a:ext cx="5943600" cy="365760"/>
+                    </a:xfrm>
+                    <a:prstGeom prst="rect">
+                      <a:avLst/>
+                    </a:prstGeom>
+                  </pic:spPr>
+                </pic:pic>
+              </a:graphicData>
+            </a:graphic>
+          </wp:inline>
+        </w:drawing>
+      </w:r>
+    </w:p>
+    <w:p/>
+    <w:p/>
+    <w:p>
+      <w:pPr>
+        <w:pStyle w:val="ListParagraph"/>
+        <w:numPr>
+          <w:ilvl w:val="0"/>
+          <w:numId w:val="1"/>
+        </w:numPr>
+      </w:pPr>
+      <w:r>
+        <w:t>Deletion</w:t>
+      </w:r>
+    </w:p>
+    <w:p>
+      <w:r>
+        <w:drawing>
+          <wp:inline distT="0" distB="0" distL="0" distR="0" wp14:anchorId="20F912F4" wp14:editId="18D2370F">
+            <wp:extent cx="5943600" cy="1819910"/>
+            <wp:effectExtent l="0" t="0" r="0" b="8890"/>
+            <wp:docPr id="13" name="Picture 13"/>
+            <wp:cNvGraphicFramePr>
+              <a:graphicFrameLocks xmlns:a="http://schemas.openxmlformats.org/drawingml/2006/main" noChangeAspect="1"/>
+            </wp:cNvGraphicFramePr>
+            <a:graphic xmlns:a="http://schemas.openxmlformats.org/drawingml/2006/main">
+              <a:graphicData uri="http://schemas.openxmlformats.org/drawingml/2006/picture">
+                <pic:pic xmlns:pic="http://schemas.openxmlformats.org/drawingml/2006/picture">
+                  <pic:nvPicPr>
+                    <pic:cNvPr id="1" name=""/>
+                    <pic:cNvPicPr/>
+                  </pic:nvPicPr>
+                  <pic:blipFill>
+                    <a:blip r:embed="rId19"/>
+                    <a:stretch>
+                      <a:fillRect/>
+                    </a:stretch>
+                  </pic:blipFill>
+                  <pic:spPr>
+                    <a:xfrm>
+                      <a:off x="0" y="0"/>
+                      <a:ext cx="5943600" cy="1819910"/>
+                    </a:xfrm>
+                    <a:prstGeom prst="rect">
+                      <a:avLst/>
+                    </a:prstGeom>
+                  </pic:spPr>
+                </pic:pic>
+              </a:graphicData>
+            </a:graphic>
+          </wp:inline>
+        </w:drawing>
+      </w:r>
+    </w:p>
+    <w:p>
+      <w:pPr>
+        <w:pStyle w:val="ListParagraph"/>
+        <w:numPr>
+          <w:ilvl w:val="0"/>
+          <w:numId w:val="1"/>
+        </w:numPr>
+      </w:pPr>
+      <w:r>
+        <w:lastRenderedPageBreak/>
+        <w:t>Persistence</w:t>
+      </w:r>
+    </w:p>
+    <w:p>
+      <w:r>
+        <w:drawing>
+          <wp:inline distT="0" distB="0" distL="0" distR="0" wp14:anchorId="1BA1DAF2" wp14:editId="41908BCF">
+            <wp:extent cx="5943600" cy="6237605"/>
+            <wp:effectExtent l="0" t="0" r="0" b="0"/>
+            <wp:docPr id="14" name="Picture 14"/>
+            <wp:cNvGraphicFramePr>
+              <a:graphicFrameLocks xmlns:a="http://schemas.openxmlformats.org/drawingml/2006/main" noChangeAspect="1"/>
+            </wp:cNvGraphicFramePr>
+            <a:graphic xmlns:a="http://schemas.openxmlformats.org/drawingml/2006/main">
+              <a:graphicData uri="http://schemas.openxmlformats.org/drawingml/2006/picture">
+                <pic:pic xmlns:pic="http://schemas.openxmlformats.org/drawingml/2006/picture">
+                  <pic:nvPicPr>
+                    <pic:cNvPr id="1" name=""/>
+                    <pic:cNvPicPr/>
+                  </pic:nvPicPr>
+                  <pic:blipFill>
+                    <a:blip r:embed="rId20"/>
+                    <a:stretch>
+                      <a:fillRect/>
+                    </a:stretch>
+                  </pic:blipFill>
+                  <pic:spPr>
+                    <a:xfrm>
+                      <a:off x="0" y="0"/>
+                      <a:ext cx="5943600" cy="6237605"/>
+                    </a:xfrm>
+                    <a:prstGeom prst="rect">
+                      <a:avLst/>
+                    </a:prstGeom>
+                  </pic:spPr>
+                </pic:pic>
+              </a:graphicData>
+            </a:graphic>
+          </wp:inline>
+        </w:drawing>
+      </w:r>
+    </w:p>
+    <w:p/>
+    <w:p/>
+    <w:p/>
+    <w:p/>
+    <w:p/>
+    <w:p>
+      <w:r>
+        <w:lastRenderedPageBreak/>
+        <w:t>Verifying the data inside H2</w:t>
+      </w:r>
+    </w:p>
+    <w:p>
+      <w:r>
+        <w:drawing>
+          <wp:inline distT="0" distB="0" distL="0" distR="0" wp14:anchorId="2A748AAC" wp14:editId="3241B50C">
+            <wp:extent cx="5943600" cy="1930400"/>
+            <wp:effectExtent l="0" t="0" r="0" b="0"/>
+            <wp:docPr id="15" name="Picture 15"/>
+            <wp:cNvGraphicFramePr>
+              <a:graphicFrameLocks xmlns:a="http://schemas.openxmlformats.org/drawingml/2006/main" noChangeAspect="1"/>
+            </wp:cNvGraphicFramePr>
+            <a:graphic xmlns:a="http://schemas.openxmlformats.org/drawingml/2006/main">
+              <a:graphicData uri="http://schemas.openxmlformats.org/drawingml/2006/picture">
+                <pic:pic xmlns:pic="http://schemas.openxmlformats.org/drawingml/2006/picture">
+                  <pic:nvPicPr>
+                    <pic:cNvPr id="1" name=""/>
+                    <pic:cNvPicPr/>
+                  </pic:nvPicPr>
+                  <pic:blipFill>
+                    <a:blip r:embed="rId21"/>
+                    <a:stretch>
+                      <a:fillRect/>
+                    </a:stretch>
+                  </pic:blipFill>
+                  <pic:spPr>
+                    <a:xfrm>
+                      <a:off x="0" y="0"/>
+                      <a:ext cx="5943600" cy="1930400"/>
+                    </a:xfrm>
+                    <a:prstGeom prst="rect">
+                      <a:avLst/>
+                    </a:prstGeom>
+                  </pic:spPr>
+                </pic:pic>
+              </a:graphicData>
+            </a:graphic>
+          </wp:inline>
+        </w:drawing>
+      </w:r>
+    </w:p>
+    <w:p>
+      <w:r>
+        <w:drawing>
+          <wp:inline distT="0" distB="0" distL="0" distR="0" wp14:anchorId="68A1D279" wp14:editId="3025D2A2">
+            <wp:extent cx="5943600" cy="1862455"/>
+            <wp:effectExtent l="0" t="0" r="0" b="4445"/>
+            <wp:docPr id="16" name="Picture 16"/>
+            <wp:cNvGraphicFramePr>
+              <a:graphicFrameLocks xmlns:a="http://schemas.openxmlformats.org/drawingml/2006/main" noChangeAspect="1"/>
+            </wp:cNvGraphicFramePr>
+            <a:graphic xmlns:a="http://schemas.openxmlformats.org/drawingml/2006/main">
+              <a:graphicData uri="http://schemas.openxmlformats.org/drawingml/2006/picture">
+                <pic:pic xmlns:pic="http://schemas.openxmlformats.org/drawingml/2006/picture">
+                  <pic:nvPicPr>
+                    <pic:cNvPr id="1" name=""/>
+                    <pic:cNvPicPr/>
+                  </pic:nvPicPr>
+                  <pic:blipFill>
+                    <a:blip r:embed="rId22"/>
+                    <a:stretch>
+                      <a:fillRect/>
+                    </a:stretch>
+                  </pic:blipFill>
+                  <pic:spPr>
+                    <a:xfrm>
+                      <a:off x="0" y="0"/>
+                      <a:ext cx="5943600" cy="1862455"/>
+                    </a:xfrm>
+                    <a:prstGeom prst="rect">
+                      <a:avLst/>
+                    </a:prstGeom>
+                  </pic:spPr>
+                </pic:pic>
+              </a:graphicData>
+            </a:graphic>
+          </wp:inline>
+        </w:drawing>
+      </w:r>
+    </w:p>
     <w:sectPr>
-      <w:headerReference w:type="default" r:id="rId13"/>
+      <w:headerReference w:type="default" r:id="rId23"/>
       <w:pgSz w:w="12240" w:h="15840"/>
       <w:pgMar w:top="1440" w:right="1440" w:bottom="1440" w:left="1440" w:header="720" w:footer="720" w:gutter="0"/>
       <w:cols w:space="720"/>
@@ -444,6 +981,195 @@
     </w:r>
   </w:p>
 </w:hdr>
+</file>
+
+<file path=word/numbering.xml><?xml version="1.0" encoding="utf-8"?>
+<w:numbering xmlns:wpc="http://schemas.microsoft.com/office/word/2010/wordprocessingCanvas" xmlns:cx="http://schemas.microsoft.com/office/drawing/2014/chartex" xmlns:cx1="http://schemas.microsoft.com/office/drawing/2015/9/8/chartex" xmlns:cx2="http://schemas.microsoft.com/office/drawing/2015/10/21/chartex" xmlns:cx3="http://schemas.microsoft.com/office/drawing/2016/5/9/chartex" xmlns:cx4="http://schemas.microsoft.com/office/drawing/2016/5/10/chartex" xmlns:cx5="http://schemas.microsoft.com/office/drawing/2016/5/11/chartex" xmlns:cx6="http://schemas.microsoft.com/office/drawing/2016/5/12/chartex" xmlns:cx7="http://schemas.microsoft.com/office/drawing/2016/5/13/chartex" xmlns:cx8="http://schemas.microsoft.com/office/drawing/2016/5/14/chartex" xmlns:mc="http://schemas.openxmlformats.org/markup-compatibility/2006" xmlns:aink="http://schemas.microsoft.com/office/drawing/2016/ink" xmlns:am3d="http://schemas.microsoft.com/office/drawing/2017/model3d" xmlns:o="urn:schemas-microsoft-com:office:office" xmlns:r="http://schemas.openxmlformats.org/officeDocument/2006/relationships" xmlns:m="http://schemas.openxmlformats.org/officeDocument/2006/math" xmlns:v="urn:schemas-microsoft-com:vml" xmlns:wp14="http://schemas.microsoft.com/office/word/2010/wordprocessingDrawing" xmlns:wp="http://schemas.openxmlformats.org/drawingml/2006/wordprocessingDrawing" xmlns:w10="urn:schemas-microsoft-com:office:word" xmlns:w="http://schemas.openxmlformats.org/wordprocessingml/2006/main" xmlns:w14="http://schemas.microsoft.com/office/word/2010/wordml" xmlns:w15="http://schemas.microsoft.com/office/word/2012/wordml" xmlns:w16cex="http://schemas.microsoft.com/office/word/2018/wordml/cex" xmlns:w16cid="http://schemas.microsoft.com/office/word/2016/wordml/cid" xmlns:w16="http://schemas.microsoft.com/office/word/2018/wordml" xmlns:w16sdtdh="http://schemas.microsoft.com/office/word/2020/wordml/sdtdatahash" xmlns:w16se="http://schemas.microsoft.com/office/word/2015/wordml/symex" xmlns:wpg="http://schemas.microsoft.com/office/word/2010/wordprocessingGroup" xmlns:wpi="http://schemas.microsoft.com/office/word/2010/wordprocessingInk" xmlns:wne="http://schemas.microsoft.com/office/word/2006/wordml" xmlns:wps="http://schemas.microsoft.com/office/word/2010/wordprocessingShape" mc:Ignorable="w14 w15 w16se w16cid w16 w16cex w16sdtdh wp14">
+  <w:abstractNum w:abstractNumId="0" w15:restartNumberingAfterBreak="0">
+    <w:nsid w:val="0233154A"/>
+    <w:multiLevelType w:val="hybridMultilevel"/>
+    <w:tmpl w:val="FDDA1BB0"/>
+    <w:lvl w:ilvl="0" w:tplc="ACBE76B2">
+      <w:start w:val="1"/>
+      <w:numFmt w:val="lowerRoman"/>
+      <w:lvlText w:val="%1)"/>
+      <w:lvlJc w:val="left"/>
+      <w:pPr>
+        <w:ind w:left="1080" w:hanging="720"/>
+      </w:pPr>
+      <w:rPr>
+        <w:rFonts w:hint="default"/>
+      </w:rPr>
+    </w:lvl>
+    <w:lvl w:ilvl="1" w:tplc="04090019" w:tentative="1">
+      <w:start w:val="1"/>
+      <w:numFmt w:val="lowerLetter"/>
+      <w:lvlText w:val="%2."/>
+      <w:lvlJc w:val="left"/>
+      <w:pPr>
+        <w:ind w:left="1440" w:hanging="360"/>
+      </w:pPr>
+    </w:lvl>
+    <w:lvl w:ilvl="2" w:tplc="0409001B" w:tentative="1">
+      <w:start w:val="1"/>
+      <w:numFmt w:val="lowerRoman"/>
+      <w:lvlText w:val="%3."/>
+      <w:lvlJc w:val="right"/>
+      <w:pPr>
+        <w:ind w:left="2160" w:hanging="180"/>
+      </w:pPr>
+    </w:lvl>
+    <w:lvl w:ilvl="3" w:tplc="0409000F" w:tentative="1">
+      <w:start w:val="1"/>
+      <w:numFmt w:val="decimal"/>
+      <w:lvlText w:val="%4."/>
+      <w:lvlJc w:val="left"/>
+      <w:pPr>
+        <w:ind w:left="2880" w:hanging="360"/>
+      </w:pPr>
+    </w:lvl>
+    <w:lvl w:ilvl="4" w:tplc="04090019" w:tentative="1">
+      <w:start w:val="1"/>
+      <w:numFmt w:val="lowerLetter"/>
+      <w:lvlText w:val="%5."/>
+      <w:lvlJc w:val="left"/>
+      <w:pPr>
+        <w:ind w:left="3600" w:hanging="360"/>
+      </w:pPr>
+    </w:lvl>
+    <w:lvl w:ilvl="5" w:tplc="0409001B" w:tentative="1">
+      <w:start w:val="1"/>
+      <w:numFmt w:val="lowerRoman"/>
+      <w:lvlText w:val="%6."/>
+      <w:lvlJc w:val="right"/>
+      <w:pPr>
+        <w:ind w:left="4320" w:hanging="180"/>
+      </w:pPr>
+    </w:lvl>
+    <w:lvl w:ilvl="6" w:tplc="0409000F" w:tentative="1">
+      <w:start w:val="1"/>
+      <w:numFmt w:val="decimal"/>
+      <w:lvlText w:val="%7."/>
+      <w:lvlJc w:val="left"/>
+      <w:pPr>
+        <w:ind w:left="5040" w:hanging="360"/>
+      </w:pPr>
+    </w:lvl>
+    <w:lvl w:ilvl="7" w:tplc="04090019" w:tentative="1">
+      <w:start w:val="1"/>
+      <w:numFmt w:val="lowerLetter"/>
+      <w:lvlText w:val="%8."/>
+      <w:lvlJc w:val="left"/>
+      <w:pPr>
+        <w:ind w:left="5760" w:hanging="360"/>
+      </w:pPr>
+    </w:lvl>
+    <w:lvl w:ilvl="8" w:tplc="0409001B" w:tentative="1">
+      <w:start w:val="1"/>
+      <w:numFmt w:val="lowerRoman"/>
+      <w:lvlText w:val="%9."/>
+      <w:lvlJc w:val="right"/>
+      <w:pPr>
+        <w:ind w:left="6480" w:hanging="180"/>
+      </w:pPr>
+    </w:lvl>
+  </w:abstractNum>
+  <w:abstractNum w:abstractNumId="1" w15:restartNumberingAfterBreak="0">
+    <w:nsid w:val="6ADA6C53"/>
+    <w:multiLevelType w:val="hybridMultilevel"/>
+    <w:tmpl w:val="6B0E9768"/>
+    <w:lvl w:ilvl="0" w:tplc="792877A4">
+      <w:start w:val="1"/>
+      <w:numFmt w:val="upperLetter"/>
+      <w:lvlText w:val="%1)"/>
+      <w:lvlJc w:val="left"/>
+      <w:pPr>
+        <w:ind w:left="720" w:hanging="360"/>
+      </w:pPr>
+      <w:rPr>
+        <w:rFonts w:hint="default"/>
+      </w:rPr>
+    </w:lvl>
+    <w:lvl w:ilvl="1" w:tplc="04090019" w:tentative="1">
+      <w:start w:val="1"/>
+      <w:numFmt w:val="lowerLetter"/>
+      <w:lvlText w:val="%2."/>
+      <w:lvlJc w:val="left"/>
+      <w:pPr>
+        <w:ind w:left="1440" w:hanging="360"/>
+      </w:pPr>
+    </w:lvl>
+    <w:lvl w:ilvl="2" w:tplc="0409001B" w:tentative="1">
+      <w:start w:val="1"/>
+      <w:numFmt w:val="lowerRoman"/>
+      <w:lvlText w:val="%3."/>
+      <w:lvlJc w:val="right"/>
+      <w:pPr>
+        <w:ind w:left="2160" w:hanging="180"/>
+      </w:pPr>
+    </w:lvl>
+    <w:lvl w:ilvl="3" w:tplc="0409000F" w:tentative="1">
+      <w:start w:val="1"/>
+      <w:numFmt w:val="decimal"/>
+      <w:lvlText w:val="%4."/>
+      <w:lvlJc w:val="left"/>
+      <w:pPr>
+        <w:ind w:left="2880" w:hanging="360"/>
+      </w:pPr>
+    </w:lvl>
+    <w:lvl w:ilvl="4" w:tplc="04090019" w:tentative="1">
+      <w:start w:val="1"/>
+      <w:numFmt w:val="lowerLetter"/>
+      <w:lvlText w:val="%5."/>
+      <w:lvlJc w:val="left"/>
+      <w:pPr>
+        <w:ind w:left="3600" w:hanging="360"/>
+      </w:pPr>
+    </w:lvl>
+    <w:lvl w:ilvl="5" w:tplc="0409001B" w:tentative="1">
+      <w:start w:val="1"/>
+      <w:numFmt w:val="lowerRoman"/>
+      <w:lvlText w:val="%6."/>
+      <w:lvlJc w:val="right"/>
+      <w:pPr>
+        <w:ind w:left="4320" w:hanging="180"/>
+      </w:pPr>
+    </w:lvl>
+    <w:lvl w:ilvl="6" w:tplc="0409000F" w:tentative="1">
+      <w:start w:val="1"/>
+      <w:numFmt w:val="decimal"/>
+      <w:lvlText w:val="%7."/>
+      <w:lvlJc w:val="left"/>
+      <w:pPr>
+        <w:ind w:left="5040" w:hanging="360"/>
+      </w:pPr>
+    </w:lvl>
+    <w:lvl w:ilvl="7" w:tplc="04090019" w:tentative="1">
+      <w:start w:val="1"/>
+      <w:numFmt w:val="lowerLetter"/>
+      <w:lvlText w:val="%8."/>
+      <w:lvlJc w:val="left"/>
+      <w:pPr>
+        <w:ind w:left="5760" w:hanging="360"/>
+      </w:pPr>
+    </w:lvl>
+    <w:lvl w:ilvl="8" w:tplc="0409001B" w:tentative="1">
+      <w:start w:val="1"/>
+      <w:numFmt w:val="lowerRoman"/>
+      <w:lvlText w:val="%9."/>
+      <w:lvlJc w:val="right"/>
+      <w:pPr>
+        <w:ind w:left="6480" w:hanging="180"/>
+      </w:pPr>
+    </w:lvl>
+  </w:abstractNum>
+  <w:num w:numId="1">
+    <w:abstractNumId w:val="0"/>
+  </w:num>
+  <w:num w:numId="2">
+    <w:abstractNumId w:val="1"/>
+  </w:num>
+</w:numbering>
 </file>
 
 <file path=word/styles.xml><?xml version="1.0" encoding="utf-8"?>
@@ -916,6 +1642,17 @@
     <w:uiPriority w:val="99"/>
     <w:rsid w:val="004876CD"/>
   </w:style>
+  <w:style w:type="paragraph" w:styleId="ListParagraph">
+    <w:name w:val="List Paragraph"/>
+    <w:basedOn w:val="Normal"/>
+    <w:uiPriority w:val="34"/>
+    <w:qFormat/>
+    <w:rsid w:val="00BA5F3B"/>
+    <w:pPr>
+      <w:ind w:left="720"/>
+      <w:contextualSpacing/>
+    </w:pPr>
+  </w:style>
 </w:styles>
 </file>
 

</xml_diff>

<commit_message>
add task 11 to the word document
</commit_message>
<xml_diff>
--- a/Documents/word.docx
+++ b/Documents/word.docx
@@ -467,6 +467,9 @@
     </w:p>
     <w:p>
       <w:r>
+        <w:rPr>
+          <w:noProof/>
+        </w:rPr>
         <w:drawing>
           <wp:inline distT="0" distB="0" distL="0" distR="0" wp14:anchorId="063A623B" wp14:editId="2B313516">
             <wp:extent cx="3829050" cy="4941357"/>
@@ -506,6 +509,9 @@
     </w:p>
     <w:p>
       <w:r>
+        <w:rPr>
+          <w:noProof/>
+        </w:rPr>
         <w:drawing>
           <wp:inline distT="0" distB="0" distL="0" distR="0" wp14:anchorId="0E97E592" wp14:editId="25B23BB4">
             <wp:extent cx="5133975" cy="1804570"/>
@@ -559,6 +565,9 @@
     </w:p>
     <w:p>
       <w:r>
+        <w:rPr>
+          <w:noProof/>
+        </w:rPr>
         <w:drawing>
           <wp:inline distT="0" distB="0" distL="0" distR="0" wp14:anchorId="741CCBB0" wp14:editId="7C93F92F">
             <wp:extent cx="5943600" cy="7292340"/>
@@ -613,6 +622,9 @@
     </w:p>
     <w:p>
       <w:r>
+        <w:rPr>
+          <w:noProof/>
+        </w:rPr>
         <w:drawing>
           <wp:inline distT="0" distB="0" distL="0" distR="0" wp14:anchorId="2436FD5A" wp14:editId="7BEA81C0">
             <wp:extent cx="5943600" cy="3605530"/>
@@ -666,6 +678,9 @@
     </w:p>
     <w:p>
       <w:r>
+        <w:rPr>
+          <w:noProof/>
+        </w:rPr>
         <w:drawing>
           <wp:inline distT="0" distB="0" distL="0" distR="0" wp14:anchorId="5C0A878F" wp14:editId="4C4BED9A">
             <wp:extent cx="5943600" cy="365760"/>
@@ -719,6 +734,9 @@
     </w:p>
     <w:p>
       <w:r>
+        <w:rPr>
+          <w:noProof/>
+        </w:rPr>
         <w:drawing>
           <wp:inline distT="0" distB="0" distL="0" distR="0" wp14:anchorId="20F912F4" wp14:editId="18D2370F">
             <wp:extent cx="5943600" cy="1819910"/>
@@ -771,6 +789,9 @@
     </w:p>
     <w:p>
       <w:r>
+        <w:rPr>
+          <w:noProof/>
+        </w:rPr>
         <w:drawing>
           <wp:inline distT="0" distB="0" distL="0" distR="0" wp14:anchorId="1BA1DAF2" wp14:editId="41908BCF">
             <wp:extent cx="5943600" cy="6237605"/>
@@ -821,6 +842,9 @@
     </w:p>
     <w:p>
       <w:r>
+        <w:rPr>
+          <w:noProof/>
+        </w:rPr>
         <w:drawing>
           <wp:inline distT="0" distB="0" distL="0" distR="0" wp14:anchorId="2A748AAC" wp14:editId="3241B50C">
             <wp:extent cx="5943600" cy="1930400"/>
@@ -860,6 +884,9 @@
     </w:p>
     <w:p>
       <w:r>
+        <w:rPr>
+          <w:noProof/>
+        </w:rPr>
         <w:drawing>
           <wp:inline distT="0" distB="0" distL="0" distR="0" wp14:anchorId="68A1D279" wp14:editId="3025D2A2">
             <wp:extent cx="5943600" cy="1862455"/>
@@ -897,8 +924,187 @@
         </w:drawing>
       </w:r>
     </w:p>
+    <w:p/>
+    <w:p/>
+    <w:p/>
+    <w:p/>
+    <w:p>
+      <w:pPr>
+        <w:rPr>
+          <w:u w:val="single"/>
+        </w:rPr>
+      </w:pPr>
+      <w:r>
+        <w:rPr>
+          <w:u w:val="single"/>
+        </w:rPr>
+        <w:t>Task 10</w:t>
+      </w:r>
+    </w:p>
+    <w:p>
+      <w:r>
+        <w:drawing>
+          <wp:inline distT="0" distB="0" distL="0" distR="0" wp14:anchorId="42BA69F6" wp14:editId="41B48F75">
+            <wp:extent cx="5943600" cy="1819910"/>
+            <wp:effectExtent l="0" t="0" r="0" b="8890"/>
+            <wp:docPr id="17" name="Picture 17"/>
+            <wp:cNvGraphicFramePr>
+              <a:graphicFrameLocks xmlns:a="http://schemas.openxmlformats.org/drawingml/2006/main" noChangeAspect="1"/>
+            </wp:cNvGraphicFramePr>
+            <a:graphic xmlns:a="http://schemas.openxmlformats.org/drawingml/2006/main">
+              <a:graphicData uri="http://schemas.openxmlformats.org/drawingml/2006/picture">
+                <pic:pic xmlns:pic="http://schemas.openxmlformats.org/drawingml/2006/picture">
+                  <pic:nvPicPr>
+                    <pic:cNvPr id="1" name=""/>
+                    <pic:cNvPicPr/>
+                  </pic:nvPicPr>
+                  <pic:blipFill>
+                    <a:blip r:embed="rId23"/>
+                    <a:stretch>
+                      <a:fillRect/>
+                    </a:stretch>
+                  </pic:blipFill>
+                  <pic:spPr>
+                    <a:xfrm>
+                      <a:off x="0" y="0"/>
+                      <a:ext cx="5943600" cy="1819910"/>
+                    </a:xfrm>
+                    <a:prstGeom prst="rect">
+                      <a:avLst/>
+                    </a:prstGeom>
+                  </pic:spPr>
+                </pic:pic>
+              </a:graphicData>
+            </a:graphic>
+          </wp:inline>
+        </w:drawing>
+      </w:r>
+    </w:p>
+    <w:p/>
+    <w:p/>
+    <w:p>
+      <w:pPr>
+        <w:rPr>
+          <w:u w:val="single"/>
+        </w:rPr>
+      </w:pPr>
+      <w:r>
+        <w:rPr>
+          <w:u w:val="single"/>
+        </w:rPr>
+        <w:lastRenderedPageBreak/>
+        <w:t>Task 11</w:t>
+      </w:r>
+    </w:p>
+    <w:p>
+      <w:pPr>
+        <w:rPr>
+          <w:u w:val="single"/>
+        </w:rPr>
+      </w:pPr>
+    </w:p>
+    <w:p>
+      <w:r>
+        <w:t>data/</w:t>
+      </w:r>
+      <w:proofErr w:type="spellStart"/>
+      <w:r>
+        <w:t>student</w:t>
+      </w:r>
+      <w:r>
+        <w:t>db.mv.db</w:t>
+      </w:r>
+      <w:proofErr w:type="spellEnd"/>
+      <w:r>
+        <w:t xml:space="preserve"> file has been created</w:t>
+      </w:r>
+    </w:p>
+    <w:p>
+      <w:r>
+        <w:drawing>
+          <wp:inline distT="0" distB="0" distL="0" distR="0" wp14:anchorId="27B385B7" wp14:editId="2D1D7275">
+            <wp:extent cx="1543265" cy="952633"/>
+            <wp:effectExtent l="0" t="0" r="0" b="0"/>
+            <wp:docPr id="18" name="Picture 18"/>
+            <wp:cNvGraphicFramePr>
+              <a:graphicFrameLocks xmlns:a="http://schemas.openxmlformats.org/drawingml/2006/main" noChangeAspect="1"/>
+            </wp:cNvGraphicFramePr>
+            <a:graphic xmlns:a="http://schemas.openxmlformats.org/drawingml/2006/main">
+              <a:graphicData uri="http://schemas.openxmlformats.org/drawingml/2006/picture">
+                <pic:pic xmlns:pic="http://schemas.openxmlformats.org/drawingml/2006/picture">
+                  <pic:nvPicPr>
+                    <pic:cNvPr id="1" name=""/>
+                    <pic:cNvPicPr/>
+                  </pic:nvPicPr>
+                  <pic:blipFill>
+                    <a:blip r:embed="rId24"/>
+                    <a:stretch>
+                      <a:fillRect/>
+                    </a:stretch>
+                  </pic:blipFill>
+                  <pic:spPr>
+                    <a:xfrm>
+                      <a:off x="0" y="0"/>
+                      <a:ext cx="1543265" cy="952633"/>
+                    </a:xfrm>
+                    <a:prstGeom prst="rect">
+                      <a:avLst/>
+                    </a:prstGeom>
+                  </pic:spPr>
+                </pic:pic>
+              </a:graphicData>
+            </a:graphic>
+          </wp:inline>
+        </w:drawing>
+      </w:r>
+    </w:p>
+    <w:p/>
+    <w:p>
+      <w:r>
+        <w:t>The data in the table doesn’t get lost when stopping and re running the application</w:t>
+      </w:r>
+    </w:p>
+    <w:p>
+      <w:r>
+        <w:drawing>
+          <wp:inline distT="0" distB="0" distL="0" distR="0" wp14:anchorId="1B3802AA" wp14:editId="166DD7B7">
+            <wp:extent cx="5943600" cy="5169535"/>
+            <wp:effectExtent l="0" t="0" r="0" b="0"/>
+            <wp:docPr id="19" name="Picture 19"/>
+            <wp:cNvGraphicFramePr>
+              <a:graphicFrameLocks xmlns:a="http://schemas.openxmlformats.org/drawingml/2006/main" noChangeAspect="1"/>
+            </wp:cNvGraphicFramePr>
+            <a:graphic xmlns:a="http://schemas.openxmlformats.org/drawingml/2006/main">
+              <a:graphicData uri="http://schemas.openxmlformats.org/drawingml/2006/picture">
+                <pic:pic xmlns:pic="http://schemas.openxmlformats.org/drawingml/2006/picture">
+                  <pic:nvPicPr>
+                    <pic:cNvPr id="1" name=""/>
+                    <pic:cNvPicPr/>
+                  </pic:nvPicPr>
+                  <pic:blipFill>
+                    <a:blip r:embed="rId25"/>
+                    <a:stretch>
+                      <a:fillRect/>
+                    </a:stretch>
+                  </pic:blipFill>
+                  <pic:spPr>
+                    <a:xfrm>
+                      <a:off x="0" y="0"/>
+                      <a:ext cx="5943600" cy="5169535"/>
+                    </a:xfrm>
+                    <a:prstGeom prst="rect">
+                      <a:avLst/>
+                    </a:prstGeom>
+                  </pic:spPr>
+                </pic:pic>
+              </a:graphicData>
+            </a:graphic>
+          </wp:inline>
+        </w:drawing>
+      </w:r>
+    </w:p>
     <w:sectPr>
-      <w:headerReference w:type="default" r:id="rId23"/>
+      <w:headerReference w:type="default" r:id="rId26"/>
       <w:pgSz w:w="12240" w:h="15840"/>
       <w:pgMar w:top="1440" w:right="1440" w:bottom="1440" w:left="1440" w:header="720" w:footer="720" w:gutter="0"/>
       <w:cols w:space="720"/>

</xml_diff>